<commit_message>
Add tab names to E04/E05 evidence references
E04 decisions: tab 2_Cisco Network Administrators rows 2538-2539; Netwrix log:
tabs 2-3 section REVOCATION EVIDENCE row 2976; AD extract: tabs 2-3 row 1639;
E05: tab 2.Cisco Network Administrators rows 3260, 3265. Applied to the testing
procedures, the design/sample-of-one document and E09; E00 MD5s refreshed.

Co-Authored-By: Claude Opus 5.5 <noreply@anthropic.com>
Claude-Session: https://claude.ai/code/session_01RkbhuEGeprMY3UGeKiEnsh
</commit_message>
<xml_diff>
--- a/BSI.IT.27.C7/BSI.IT.27.C7_Design_WT_Sample_of_1_MIA25142.docx
+++ b/BSI.IT.27.C7/BSI.IT.27.C7_Design_WT_Sample_of_1_MIA25142.docx
@@ -2957,7 +2957,7 @@
         <w:jc w:val="both"/>
       </w:pPr>
       <w:r>
-        <w:t xml:space="preserve">Sample of one: MIA25142 was traced end to end – 2025 Q3 revoke decision (E04 rows 2538–2539), removal in Netwrix on 09/02/2025 (E04), back in both groups in AD on 11/25/2025 (E04 AD row 1639), approved again in 2026 Q1 (E05 rows 3260, 3265) and 2026 Q2 (E07; E06.13). Results are in Section 3; every location is listed in Section 4.</w:t>
+        <w:t>Sample of one: MIA25142 was traced end to end – 2025 Q3 revoke decision (E04 tab 2_Cisco Network Administrators, rows 2538–2539), removal in Netwrix on 09/02/2025 (E04 tabs 2_Cisco Network Administrators and 3_ISEAdmin, section REVOCATION EVIDENCE, row 2976 (Netwrix log)), back in both groups in AD on 11/25/2025 (E04 tabs 2_Cisco Network Administrators and 3_ISEAdmin, AD extract 11/25/2025, row 1639), approved again in 2026 Q1 (E05 tab 2.Cisco Network Administrators, rows 3260, 3265) and 2026 Q2 (E07; E06.13). Results are in Section 3; every location is listed in Section 4.</w:t>
       </w:r>
     </w:p>
     <w:p>
@@ -3180,7 +3180,7 @@
               <w:rPr>
                 <w:sz w:val="16"/>
               </w:rPr>
-              <w:t xml:space="preserve">E04; E05; E06.3 rows 6, 10; E01 SUS.IAMS.4.2.5.19</w:t>
+              <w:t>E04 tab 2_Cisco Network Administrators (launch 8/1/2025); E05 tab 2.Cisco Network Administrators (launch 4/9/2026); E06.3 rows 6, 10; E01 SUS.IAMS.4.2.5.19</w:t>
             </w:r>
           </w:p>
         </w:tc>
@@ -3284,7 +3284,7 @@
               <w:rPr>
                 <w:sz w:val="16"/>
               </w:rPr>
-              <w:t xml:space="preserve">E04 tab 2; E02 4.1.1 C1</w:t>
+              <w:t>E04 tab 2_Cisco Network Administrators; E02 4.1.1 C1</w:t>
             </w:r>
           </w:p>
         </w:tc>
@@ -3388,7 +3388,7 @@
               <w:rPr>
                 <w:sz w:val="16"/>
               </w:rPr>
-              <w:t xml:space="preserve">E04 rows 2538–2539, AD row 1639; E03 sec. 3.3; E06.4 rows 19, 57</w:t>
+              <w:t>E04 tab 2_Cisco Network Administrators, rows 2538–2539, AD row 1639; E03 sec. 3.3; E06.4 rows 19, 57</w:t>
             </w:r>
           </w:p>
         </w:tc>
@@ -3492,7 +3492,7 @@
               <w:rPr>
                 <w:sz w:val="16"/>
               </w:rPr>
-              <w:t xml:space="preserve">E04 rows 2538–2539; E06.4 rows 19, 57 (col S)</w:t>
+              <w:t>E04 tab 2_Cisco Network Administrators, rows 2538–2539; E06.4 rows 19, 57 (col S)</w:t>
             </w:r>
           </w:p>
         </w:tc>
@@ -3596,7 +3596,7 @@
               <w:rPr>
                 <w:sz w:val="16"/>
               </w:rPr>
-              <w:t xml:space="preserve">E04 rows 2538–2539; E06.4 rows 19, 57 (col T)</w:t>
+              <w:t>E04 tab 2_Cisco Network Administrators, rows 2538–2539; E06.4 rows 19, 57 (col T)</w:t>
             </w:r>
           </w:p>
         </w:tc>
@@ -3700,7 +3700,7 @@
               <w:rPr>
                 <w:sz w:val="16"/>
               </w:rPr>
-              <w:t xml:space="preserve">E04 rows 2538–2539; E01 SUS.IAMS.4.2.5.1</w:t>
+              <w:t>E04 tab 2_Cisco Network Administrators, rows 2538–2539; E01 SUS.IAMS.4.2.5.1</w:t>
             </w:r>
           </w:p>
         </w:tc>
@@ -3804,7 +3804,7 @@
               <w:rPr>
                 <w:sz w:val="16"/>
               </w:rPr>
-              <w:t xml:space="preserve">E04 Netwrix log; E02 4.1.1 C3–C4</w:t>
+              <w:t>E04 tabs 2_Cisco Network Administrators and 3_ISEAdmin, section REVOCATION EVIDENCE, row 2976 (Netwrix log); E02 4.1.1 C3–C4</w:t>
             </w:r>
           </w:p>
         </w:tc>
@@ -3908,7 +3908,7 @@
               <w:rPr>
                 <w:sz w:val="16"/>
               </w:rPr>
-              <w:t xml:space="preserve">E04; E01 SUS.IAMS.4.2.5.21; E06.11 tab R1 row 4</w:t>
+              <w:t>E04 tabs 2_Cisco Network Administrators and 3_ISEAdmin, section REVOCATION EVIDENCE, row 2976 (Netwrix log); E01 SUS.IAMS.4.2.5.21; E06.11 tab R1 row 4</w:t>
             </w:r>
           </w:p>
         </w:tc>
@@ -4012,7 +4012,7 @@
               <w:rPr>
                 <w:sz w:val="16"/>
               </w:rPr>
-              <w:t xml:space="preserve">E04 AD row 1639; E06.4 rows 19, 57 (col V); E06.5 row 8; E01 SUS.IAMS.4.2.5.10; E02 sec. 4.2</w:t>
+              <w:t>E04 tabs 2_Cisco Network Administrators and 3_ISEAdmin, AD extract 11/25/2025, row 1639; E06.4 rows 19, 57 (col V); E06.5 row 8; E01 SUS.IAMS.4.2.5.10; E02 sec. 4.2</w:t>
             </w:r>
           </w:p>
         </w:tc>
@@ -4117,7 +4117,7 @@
               <w:rPr>
                 <w:sz w:val="16"/>
               </w:rPr>
-              <w:t xml:space="preserve">E05 rows 3260, 3265; E06.4 rows 107, 130; E06.3 rows 10–11</w:t>
+              <w:t>E05 tab 2.Cisco Network Administrators, rows 3260, 3265; E06.4 rows 107, 130; E06.3 rows 10–11</w:t>
             </w:r>
           </w:p>
         </w:tc>
@@ -4715,7 +4715,7 @@
               <w:rPr>
                 <w:sz w:val="17"/>
               </w:rPr>
-              <w:t xml:space="preserve">BSI.IT.27.C7.02 Q3_2025.xlsx – tab 2 rows 2538–2539; Netwrix tab; AD extract 11/25/2025 row 1639</w:t>
+              <w:t>BSI.IT.27.C7_E04_Q3_2025.xlsx – tab 2_Cisco Network Administrators, rows 2538–2539; tabs 2_Cisco Network Administrators and 3_ISEAdmin, section REVOCATION EVIDENCE, row 2976 (Netwrix log); tabs 2_Cisco Network Administrators and 3_ISEAdmin, AD extract 11/25/2025, row 1639</w:t>
             </w:r>
           </w:p>
         </w:tc>
@@ -5516,7 +5516,7 @@
               <w:rPr>
                 <w:sz w:val="18"/>
               </w:rPr>
-              <w:t xml:space="preserve">2025 Q3 PAM BSI SOX Manager Certification (launched 08/01/2025) / Revoked 08/28/2025 by Borges, Dayam (line manager) – E04 rows 2538–2539</w:t>
+              <w:t>2025 Q3 PAM BSI SOX Manager Certification (launched 08/01/2025) / Revoked 08/28/2025 by Borges, Dayam (line manager) – E04 tab 2_Cisco Network Administrators, rows 2538–2539</w:t>
             </w:r>
           </w:p>
         </w:tc>
@@ -5626,7 +5626,7 @@
               <w:rPr>
                 <w:sz w:val="18"/>
               </w:rPr>
-              <w:t xml:space="preserve">Member of both groups again; account enabled; last logon 11/19/2025 (E04 AD row 1639) – removal not sustained (A6 Fail)</w:t>
+              <w:t>Member of both groups again; account enabled; last logon 11/19/2025 (E04 tabs 2_Cisco Network Administrators and 3_ISEAdmin, AD extract 11/25/2025, row 1639) – removal not sustained (A6 Fail)</w:t>
             </w:r>
           </w:p>
         </w:tc>

</xml_diff>